<commit_message>
Modificacion documento de diseño
</commit_message>
<xml_diff>
--- a/Fase_2/Evidencias Proyecto/Documento 05 - Documento de Diseño.docx
+++ b/Fase_2/Evidencias Proyecto/Documento 05 - Documento de Diseño.docx
@@ -982,7 +982,23 @@
           <w:lang w:val="es-ES"/>
         </w:rPr>
         <w:tab/>
-        <w:t>3.3 Vista Despliegue……………………………………………………………………..10</w:t>
+      </w:r>
+      <w:r>
+        <w:rPr>
+          <w:rFonts w:ascii="Arial" w:hAnsi="Arial" w:cs="Arial"/>
+          <w:color w:val="1F497D" w:themeColor="text2"/>
+          <w:lang w:val="es-ES"/>
+        </w:rPr>
+        <w:tab/>
+      </w:r>
+      <w:r>
+        <w:rPr>
+          <w:rFonts w:ascii="Arial" w:hAnsi="Arial" w:cs="Arial"/>
+          <w:color w:val="1F497D" w:themeColor="text2"/>
+          <w:lang w:val="es-ES"/>
+        </w:rPr>
+        <w:tab/>
+        <w:t>3.2.3.1 Diccionario de participantes…………………………………..10</w:t>
       </w:r>
     </w:p>
     <w:p>
@@ -1010,7 +1026,79 @@
           <w:lang w:val="es-ES"/>
         </w:rPr>
         <w:tab/>
-        <w:t>3.3.1 Diagrama de componentes………………………………………………10</w:t>
+      </w:r>
+      <w:r>
+        <w:rPr>
+          <w:rFonts w:ascii="Arial" w:hAnsi="Arial" w:cs="Arial"/>
+          <w:color w:val="1F497D" w:themeColor="text2"/>
+          <w:lang w:val="es-ES"/>
+        </w:rPr>
+        <w:tab/>
+        <w:t>3.2.3.2 Diccionario de mensajes………………………………………11</w:t>
+      </w:r>
+    </w:p>
+    <w:p>
+      <w:pPr>
+        <w:spacing w:after="0"/>
+        <w:jc w:val="both"/>
+        <w:rPr>
+          <w:rFonts w:ascii="Arial" w:hAnsi="Arial" w:cs="Arial"/>
+          <w:color w:val="1F497D" w:themeColor="text2"/>
+          <w:lang w:val="es-ES"/>
+        </w:rPr>
+      </w:pPr>
+      <w:r>
+        <w:rPr>
+          <w:rFonts w:ascii="Arial" w:hAnsi="Arial" w:cs="Arial"/>
+          <w:color w:val="1F497D" w:themeColor="text2"/>
+          <w:lang w:val="es-ES"/>
+        </w:rPr>
+        <w:tab/>
+        <w:t>3.3 Vista Despliegue……………………………………………………………………..1</w:t>
+      </w:r>
+      <w:r>
+        <w:rPr>
+          <w:rFonts w:ascii="Arial" w:hAnsi="Arial" w:cs="Arial"/>
+          <w:color w:val="1F497D" w:themeColor="text2"/>
+          <w:lang w:val="es-ES"/>
+        </w:rPr>
+        <w:t>2</w:t>
+      </w:r>
+    </w:p>
+    <w:p>
+      <w:pPr>
+        <w:spacing w:after="0"/>
+        <w:jc w:val="both"/>
+        <w:rPr>
+          <w:rFonts w:ascii="Arial" w:hAnsi="Arial" w:cs="Arial"/>
+          <w:color w:val="1F497D" w:themeColor="text2"/>
+          <w:lang w:val="es-ES"/>
+        </w:rPr>
+      </w:pPr>
+      <w:r>
+        <w:rPr>
+          <w:rFonts w:ascii="Arial" w:hAnsi="Arial" w:cs="Arial"/>
+          <w:color w:val="1F497D" w:themeColor="text2"/>
+          <w:lang w:val="es-ES"/>
+        </w:rPr>
+        <w:tab/>
+      </w:r>
+      <w:r>
+        <w:rPr>
+          <w:rFonts w:ascii="Arial" w:hAnsi="Arial" w:cs="Arial"/>
+          <w:color w:val="1F497D" w:themeColor="text2"/>
+          <w:lang w:val="es-ES"/>
+        </w:rPr>
+        <w:tab/>
+        <w:t>3.3.1 Diagrama de componentes………………………………………………1</w:t>
+      </w:r>
+      <w:r>
+        <w:rPr>
+          <w:rFonts w:ascii="Arial" w:hAnsi="Arial" w:cs="Arial"/>
+          <w:color w:val="1F497D" w:themeColor="text2"/>
+          <w:lang w:val="es-ES"/>
+        </w:rPr>
+        <w:t>2</w:t>
       </w:r>
     </w:p>
     <w:p>
@@ -1054,7 +1142,15 @@
           <w:color w:val="1F497D" w:themeColor="text2"/>
           <w:lang w:val="es-ES"/>
         </w:rPr>
-        <w:t>………………………11</w:t>
+        <w:t>………………………1</w:t>
+      </w:r>
+      <w:r>
+        <w:rPr>
+          <w:rFonts w:ascii="Arial" w:hAnsi="Arial" w:cs="Arial"/>
+          <w:color w:val="1F497D" w:themeColor="text2"/>
+          <w:lang w:val="es-ES"/>
+        </w:rPr>
+        <w:t>2</w:t>
       </w:r>
     </w:p>
     <w:p>
@@ -1114,7 +1210,15 @@
           <w:color w:val="1F497D" w:themeColor="text2"/>
           <w:lang w:val="es-ES"/>
         </w:rPr>
-        <w:t>………………………………………..11</w:t>
+        <w:t>………………………………………..1</w:t>
+      </w:r>
+      <w:r>
+        <w:rPr>
+          <w:rFonts w:ascii="Arial" w:hAnsi="Arial" w:cs="Arial"/>
+          <w:color w:val="1F497D" w:themeColor="text2"/>
+          <w:lang w:val="es-ES"/>
+        </w:rPr>
+        <w:t>3</w:t>
       </w:r>
     </w:p>
     <w:p>
@@ -1817,6 +1921,7 @@
                 <w:szCs w:val="24"/>
                 <w:lang w:val="es-ES" w:eastAsia="es-ES"/>
               </w:rPr>
+              <w:lastRenderedPageBreak/>
               <w:t>Benjamin Tapia Vergara</w:t>
             </w:r>
           </w:p>
@@ -1876,7 +1981,6 @@
                 <w:szCs w:val="24"/>
                 <w:lang w:val="es-ES" w:eastAsia="es-ES"/>
               </w:rPr>
-              <w:lastRenderedPageBreak/>
               <w:t>Benjamin Tapia Vergara</w:t>
             </w:r>
           </w:p>
@@ -5987,6 +6091,2263 @@
     </w:p>
     <w:p>
       <w:pPr>
+        <w:rPr>
+          <w:rFonts w:ascii="Arial" w:hAnsi="Arial" w:cs="Arial"/>
+          <w:color w:val="1F497D" w:themeColor="text2"/>
+          <w:lang w:val="es-ES" w:eastAsia="es-ES"/>
+        </w:rPr>
+      </w:pPr>
+      <w:r>
+        <w:rPr>
+          <w:rFonts w:ascii="Arial" w:hAnsi="Arial" w:cs="Arial"/>
+          <w:noProof/>
+          <w:color w:val="1F497D" w:themeColor="text2"/>
+          <w:lang w:val="es-ES" w:eastAsia="es-ES"/>
+        </w:rPr>
+        <w:drawing>
+          <wp:inline distT="0" distB="0" distL="0" distR="0" wp14:anchorId="44DF2E91" wp14:editId="4073C4BA">
+            <wp:extent cx="5605780" cy="4420870"/>
+            <wp:effectExtent l="0" t="0" r="0" b="0"/>
+            <wp:docPr id="220676216" name="Imagen 2"/>
+            <wp:cNvGraphicFramePr>
+              <a:graphicFrameLocks xmlns:a="http://schemas.openxmlformats.org/drawingml/2006/main" noChangeAspect="1"/>
+            </wp:cNvGraphicFramePr>
+            <a:graphic xmlns:a="http://schemas.openxmlformats.org/drawingml/2006/main">
+              <a:graphicData uri="http://schemas.openxmlformats.org/drawingml/2006/picture">
+                <pic:pic xmlns:pic="http://schemas.openxmlformats.org/drawingml/2006/picture">
+                  <pic:nvPicPr>
+                    <pic:cNvPr id="0" name="Picture 2"/>
+                    <pic:cNvPicPr>
+                      <a:picLocks noChangeAspect="1" noChangeArrowheads="1"/>
+                    </pic:cNvPicPr>
+                  </pic:nvPicPr>
+                  <pic:blipFill>
+                    <a:blip r:embed="rId15">
+                      <a:extLst>
+                        <a:ext uri="{28A0092B-C50C-407E-A947-70E740481C1C}">
+                          <a14:useLocalDpi xmlns:a14="http://schemas.microsoft.com/office/drawing/2010/main" val="0"/>
+                        </a:ext>
+                      </a:extLst>
+                    </a:blip>
+                    <a:srcRect/>
+                    <a:stretch>
+                      <a:fillRect/>
+                    </a:stretch>
+                  </pic:blipFill>
+                  <pic:spPr bwMode="auto">
+                    <a:xfrm>
+                      <a:off x="0" y="0"/>
+                      <a:ext cx="5605780" cy="4420870"/>
+                    </a:xfrm>
+                    <a:prstGeom prst="rect">
+                      <a:avLst/>
+                    </a:prstGeom>
+                    <a:noFill/>
+                    <a:ln>
+                      <a:noFill/>
+                    </a:ln>
+                  </pic:spPr>
+                </pic:pic>
+              </a:graphicData>
+            </a:graphic>
+          </wp:inline>
+        </w:drawing>
+      </w:r>
+    </w:p>
+    <w:p>
+      <w:pPr>
+        <w:rPr>
+          <w:rFonts w:ascii="Arial" w:hAnsi="Arial" w:cs="Arial"/>
+          <w:color w:val="1F497D" w:themeColor="text2"/>
+          <w:lang w:val="es-ES" w:eastAsia="es-ES"/>
+        </w:rPr>
+      </w:pPr>
+      <w:r>
+        <w:rPr>
+          <w:rFonts w:ascii="Arial" w:hAnsi="Arial" w:cs="Arial"/>
+          <w:color w:val="1F497D" w:themeColor="text2"/>
+          <w:lang w:val="es-ES" w:eastAsia="es-ES"/>
+        </w:rPr>
+        <w:t>Figura 3.2.3 Diagrama de secuencia ATEDA</w:t>
+      </w:r>
+    </w:p>
+    <w:p>
+      <w:pPr>
+        <w:pStyle w:val="Ttulo4"/>
+        <w:rPr>
+          <w:rFonts w:ascii="Arial" w:hAnsi="Arial" w:cs="Arial"/>
+          <w:b/>
+          <w:bCs/>
+          <w:i w:val="0"/>
+          <w:iCs w:val="0"/>
+          <w:sz w:val="24"/>
+          <w:szCs w:val="24"/>
+          <w:lang w:val="es-ES" w:eastAsia="es-ES"/>
+        </w:rPr>
+      </w:pPr>
+      <w:r>
+        <w:rPr>
+          <w:rFonts w:ascii="Arial" w:hAnsi="Arial" w:cs="Arial"/>
+          <w:b/>
+          <w:bCs/>
+          <w:i w:val="0"/>
+          <w:iCs w:val="0"/>
+          <w:sz w:val="24"/>
+          <w:szCs w:val="24"/>
+          <w:lang w:val="es-ES" w:eastAsia="es-ES"/>
+        </w:rPr>
+        <w:t>Diccionario</w:t>
+      </w:r>
+      <w:r>
+        <w:rPr>
+          <w:rFonts w:ascii="Arial" w:hAnsi="Arial" w:cs="Arial"/>
+          <w:b/>
+          <w:bCs/>
+          <w:i w:val="0"/>
+          <w:iCs w:val="0"/>
+          <w:sz w:val="24"/>
+          <w:szCs w:val="24"/>
+          <w:lang w:val="es-ES" w:eastAsia="es-ES"/>
+        </w:rPr>
+        <w:t xml:space="preserve"> de participantes</w:t>
+      </w:r>
+      <w:r>
+        <w:rPr>
+          <w:rFonts w:ascii="Arial" w:hAnsi="Arial" w:cs="Arial"/>
+          <w:b/>
+          <w:bCs/>
+          <w:i w:val="0"/>
+          <w:iCs w:val="0"/>
+          <w:sz w:val="24"/>
+          <w:szCs w:val="24"/>
+          <w:lang w:val="es-ES" w:eastAsia="es-ES"/>
+        </w:rPr>
+        <w:t xml:space="preserve"> </w:t>
+      </w:r>
+    </w:p>
+    <w:tbl>
+      <w:tblPr>
+        <w:tblStyle w:val="Tablaconcuadrcula"/>
+        <w:tblW w:w="0" w:type="auto"/>
+        <w:jc w:val="center"/>
+        <w:tblLook w:val="04A0" w:firstRow="1" w:lastRow="0" w:firstColumn="1" w:lastColumn="0" w:noHBand="0" w:noVBand="1"/>
+      </w:tblPr>
+      <w:tblGrid>
+        <w:gridCol w:w="1914"/>
+        <w:gridCol w:w="3288"/>
+        <w:gridCol w:w="3852"/>
+      </w:tblGrid>
+      <w:tr>
+        <w:trPr>
+          <w:tblHeader/>
+          <w:jc w:val="center"/>
+        </w:trPr>
+        <w:tc>
+          <w:tcPr>
+            <w:tcW w:w="1928" w:type="dxa"/>
+            <w:shd w:val="clear" w:color="auto" w:fill="1F497D" w:themeFill="text2"/>
+            <w:vAlign w:val="center"/>
+          </w:tcPr>
+          <w:p>
+            <w:pPr>
+              <w:spacing w:after="40"/>
+              <w:rPr>
+                <w:color w:val="FFFFFF" w:themeColor="background1"/>
+                <w:szCs w:val="32"/>
+              </w:rPr>
+            </w:pPr>
+            <w:r>
+              <w:rPr>
+                <w:b/>
+                <w:color w:val="FFFFFF" w:themeColor="background1"/>
+                <w:szCs w:val="32"/>
+              </w:rPr>
+              <w:t>Participante</w:t>
+            </w:r>
+          </w:p>
+        </w:tc>
+        <w:tc>
+          <w:tcPr>
+            <w:tcW w:w="3345" w:type="dxa"/>
+            <w:shd w:val="clear" w:color="auto" w:fill="1F497D" w:themeFill="text2"/>
+            <w:vAlign w:val="center"/>
+          </w:tcPr>
+          <w:p>
+            <w:pPr>
+              <w:spacing w:after="40"/>
+              <w:rPr>
+                <w:color w:val="FFFFFF" w:themeColor="background1"/>
+                <w:szCs w:val="32"/>
+              </w:rPr>
+            </w:pPr>
+            <w:r>
+              <w:rPr>
+                <w:b/>
+                <w:color w:val="FFFFFF" w:themeColor="background1"/>
+                <w:szCs w:val="32"/>
+              </w:rPr>
+              <w:t>Descripción</w:t>
+            </w:r>
+          </w:p>
+        </w:tc>
+        <w:tc>
+          <w:tcPr>
+            <w:tcW w:w="3912" w:type="dxa"/>
+            <w:shd w:val="clear" w:color="auto" w:fill="1F497D" w:themeFill="text2"/>
+            <w:vAlign w:val="center"/>
+          </w:tcPr>
+          <w:p>
+            <w:pPr>
+              <w:spacing w:after="40"/>
+              <w:rPr>
+                <w:color w:val="FFFFFF" w:themeColor="background1"/>
+                <w:szCs w:val="32"/>
+              </w:rPr>
+            </w:pPr>
+            <w:r>
+              <w:rPr>
+                <w:b/>
+                <w:color w:val="FFFFFF" w:themeColor="background1"/>
+                <w:szCs w:val="32"/>
+              </w:rPr>
+              <w:t>Responsabilidad</w:t>
+            </w:r>
+          </w:p>
+        </w:tc>
+      </w:tr>
+      <w:tr>
+        <w:trPr>
+          <w:jc w:val="center"/>
+        </w:trPr>
+        <w:tc>
+          <w:tcPr>
+            <w:tcW w:w="1928" w:type="dxa"/>
+            <w:shd w:val="clear" w:color="auto" w:fill="C6D9F1" w:themeFill="text2" w:themeFillTint="33"/>
+            <w:vAlign w:val="center"/>
+          </w:tcPr>
+          <w:p>
+            <w:pPr>
+              <w:spacing w:after="40"/>
+            </w:pPr>
+            <w:r>
+              <w:rPr>
+                <w:sz w:val="16"/>
+              </w:rPr>
+              <w:t>Usuario</w:t>
+            </w:r>
+          </w:p>
+        </w:tc>
+        <w:tc>
+          <w:tcPr>
+            <w:tcW w:w="3345" w:type="dxa"/>
+            <w:shd w:val="clear" w:color="auto" w:fill="C6D9F1" w:themeFill="text2" w:themeFillTint="33"/>
+            <w:vAlign w:val="center"/>
+          </w:tcPr>
+          <w:p>
+            <w:pPr>
+              <w:spacing w:after="40"/>
+            </w:pPr>
+            <w:r>
+              <w:rPr>
+                <w:sz w:val="16"/>
+              </w:rPr>
+              <w:t>Profesional autorizado para utilizar ATEDA.</w:t>
+            </w:r>
+          </w:p>
+        </w:tc>
+        <w:tc>
+          <w:tcPr>
+            <w:tcW w:w="3912" w:type="dxa"/>
+            <w:shd w:val="clear" w:color="auto" w:fill="C6D9F1" w:themeFill="text2" w:themeFillTint="33"/>
+            <w:vAlign w:val="center"/>
+          </w:tcPr>
+          <w:p>
+            <w:pPr>
+              <w:spacing w:after="40"/>
+            </w:pPr>
+            <w:r>
+              <w:rPr>
+                <w:sz w:val="16"/>
+              </w:rPr>
+              <w:t>Ingresar sus credenciales para acceder al sistema.</w:t>
+            </w:r>
+          </w:p>
+        </w:tc>
+      </w:tr>
+      <w:tr>
+        <w:trPr>
+          <w:jc w:val="center"/>
+        </w:trPr>
+        <w:tc>
+          <w:tcPr>
+            <w:tcW w:w="1928" w:type="dxa"/>
+            <w:shd w:val="clear" w:color="auto" w:fill="C6D9F1" w:themeFill="text2" w:themeFillTint="33"/>
+            <w:vAlign w:val="center"/>
+          </w:tcPr>
+          <w:p>
+            <w:pPr>
+              <w:spacing w:after="40"/>
+            </w:pPr>
+            <w:r>
+              <w:rPr>
+                <w:sz w:val="16"/>
+              </w:rPr>
+              <w:t>Frontend (HTML/JS)</w:t>
+            </w:r>
+          </w:p>
+        </w:tc>
+        <w:tc>
+          <w:tcPr>
+            <w:tcW w:w="3345" w:type="dxa"/>
+            <w:shd w:val="clear" w:color="auto" w:fill="C6D9F1" w:themeFill="text2" w:themeFillTint="33"/>
+            <w:vAlign w:val="center"/>
+          </w:tcPr>
+          <w:p>
+            <w:pPr>
+              <w:spacing w:after="40"/>
+            </w:pPr>
+            <w:r>
+              <w:rPr>
+                <w:sz w:val="16"/>
+              </w:rPr>
+              <w:t>Interfaz web del sistema.</w:t>
+            </w:r>
+          </w:p>
+        </w:tc>
+        <w:tc>
+          <w:tcPr>
+            <w:tcW w:w="3912" w:type="dxa"/>
+            <w:shd w:val="clear" w:color="auto" w:fill="C6D9F1" w:themeFill="text2" w:themeFillTint="33"/>
+            <w:vAlign w:val="center"/>
+          </w:tcPr>
+          <w:p>
+            <w:pPr>
+              <w:spacing w:after="40"/>
+            </w:pPr>
+            <w:r>
+              <w:rPr>
+                <w:sz w:val="16"/>
+              </w:rPr>
+              <w:t>Capturar credenciales, enviar solicitudes HTTP y mostrar respuestas.</w:t>
+            </w:r>
+          </w:p>
+        </w:tc>
+      </w:tr>
+      <w:tr>
+        <w:trPr>
+          <w:jc w:val="center"/>
+        </w:trPr>
+        <w:tc>
+          <w:tcPr>
+            <w:tcW w:w="1928" w:type="dxa"/>
+            <w:shd w:val="clear" w:color="auto" w:fill="C6D9F1" w:themeFill="text2" w:themeFillTint="33"/>
+            <w:vAlign w:val="center"/>
+          </w:tcPr>
+          <w:p>
+            <w:pPr>
+              <w:spacing w:after="40"/>
+            </w:pPr>
+            <w:r>
+              <w:rPr>
+                <w:sz w:val="16"/>
+              </w:rPr>
+              <w:t>Ruta Express</w:t>
+            </w:r>
+          </w:p>
+        </w:tc>
+        <w:tc>
+          <w:tcPr>
+            <w:tcW w:w="3345" w:type="dxa"/>
+            <w:shd w:val="clear" w:color="auto" w:fill="C6D9F1" w:themeFill="text2" w:themeFillTint="33"/>
+            <w:vAlign w:val="center"/>
+          </w:tcPr>
+          <w:p>
+            <w:pPr>
+              <w:spacing w:after="40"/>
+            </w:pPr>
+            <w:r>
+              <w:rPr>
+                <w:sz w:val="16"/>
+              </w:rPr>
+              <w:t>Componente del backend encargado del enrutamiento.</w:t>
+            </w:r>
+          </w:p>
+        </w:tc>
+        <w:tc>
+          <w:tcPr>
+            <w:tcW w:w="3912" w:type="dxa"/>
+            <w:shd w:val="clear" w:color="auto" w:fill="C6D9F1" w:themeFill="text2" w:themeFillTint="33"/>
+            <w:vAlign w:val="center"/>
+          </w:tcPr>
+          <w:p>
+            <w:pPr>
+              <w:spacing w:after="40"/>
+            </w:pPr>
+            <w:r>
+              <w:rPr>
+                <w:sz w:val="16"/>
+              </w:rPr>
+              <w:t>Recibir la solicitud y dirigirla al controlador correspondiente.</w:t>
+            </w:r>
+          </w:p>
+        </w:tc>
+      </w:tr>
+      <w:tr>
+        <w:trPr>
+          <w:jc w:val="center"/>
+        </w:trPr>
+        <w:tc>
+          <w:tcPr>
+            <w:tcW w:w="1928" w:type="dxa"/>
+            <w:shd w:val="clear" w:color="auto" w:fill="C6D9F1" w:themeFill="text2" w:themeFillTint="33"/>
+            <w:vAlign w:val="center"/>
+          </w:tcPr>
+          <w:p>
+            <w:pPr>
+              <w:spacing w:after="40"/>
+            </w:pPr>
+            <w:r>
+              <w:rPr>
+                <w:sz w:val="16"/>
+              </w:rPr>
+              <w:t>AuthController</w:t>
+            </w:r>
+          </w:p>
+        </w:tc>
+        <w:tc>
+          <w:tcPr>
+            <w:tcW w:w="3345" w:type="dxa"/>
+            <w:shd w:val="clear" w:color="auto" w:fill="C6D9F1" w:themeFill="text2" w:themeFillTint="33"/>
+            <w:vAlign w:val="center"/>
+          </w:tcPr>
+          <w:p>
+            <w:pPr>
+              <w:spacing w:after="40"/>
+            </w:pPr>
+            <w:r>
+              <w:rPr>
+                <w:sz w:val="16"/>
+              </w:rPr>
+              <w:t>Controlador del módulo de autenticación.</w:t>
+            </w:r>
+          </w:p>
+        </w:tc>
+        <w:tc>
+          <w:tcPr>
+            <w:tcW w:w="3912" w:type="dxa"/>
+            <w:shd w:val="clear" w:color="auto" w:fill="C6D9F1" w:themeFill="text2" w:themeFillTint="33"/>
+            <w:vAlign w:val="center"/>
+          </w:tcPr>
+          <w:p>
+            <w:pPr>
+              <w:spacing w:after="40"/>
+            </w:pPr>
+            <w:r>
+              <w:rPr>
+                <w:sz w:val="16"/>
+              </w:rPr>
+              <w:t>Coordinar el inicio de sesión y gestionar la respuesta HTTP.</w:t>
+            </w:r>
+          </w:p>
+        </w:tc>
+      </w:tr>
+      <w:tr>
+        <w:trPr>
+          <w:jc w:val="center"/>
+        </w:trPr>
+        <w:tc>
+          <w:tcPr>
+            <w:tcW w:w="1928" w:type="dxa"/>
+            <w:shd w:val="clear" w:color="auto" w:fill="C6D9F1" w:themeFill="text2" w:themeFillTint="33"/>
+            <w:vAlign w:val="center"/>
+          </w:tcPr>
+          <w:p>
+            <w:pPr>
+              <w:spacing w:after="40"/>
+            </w:pPr>
+            <w:r>
+              <w:rPr>
+                <w:sz w:val="16"/>
+              </w:rPr>
+              <w:t>AuthService</w:t>
+            </w:r>
+          </w:p>
+        </w:tc>
+        <w:tc>
+          <w:tcPr>
+            <w:tcW w:w="3345" w:type="dxa"/>
+            <w:shd w:val="clear" w:color="auto" w:fill="C6D9F1" w:themeFill="text2" w:themeFillTint="33"/>
+            <w:vAlign w:val="center"/>
+          </w:tcPr>
+          <w:p>
+            <w:pPr>
+              <w:spacing w:after="40"/>
+            </w:pPr>
+            <w:r>
+              <w:rPr>
+                <w:sz w:val="16"/>
+              </w:rPr>
+              <w:t>Servicio que contiene la lógica de autenticación.</w:t>
+            </w:r>
+          </w:p>
+        </w:tc>
+        <w:tc>
+          <w:tcPr>
+            <w:tcW w:w="3912" w:type="dxa"/>
+            <w:shd w:val="clear" w:color="auto" w:fill="C6D9F1" w:themeFill="text2" w:themeFillTint="33"/>
+            <w:vAlign w:val="center"/>
+          </w:tcPr>
+          <w:p>
+            <w:pPr>
+              <w:spacing w:after="40"/>
+            </w:pPr>
+            <w:r>
+              <w:rPr>
+                <w:sz w:val="16"/>
+              </w:rPr>
+              <w:t>Validar las credenciales y verificar el estado de la cuenta.</w:t>
+            </w:r>
+          </w:p>
+        </w:tc>
+      </w:tr>
+      <w:tr>
+        <w:trPr>
+          <w:jc w:val="center"/>
+        </w:trPr>
+        <w:tc>
+          <w:tcPr>
+            <w:tcW w:w="1928" w:type="dxa"/>
+            <w:shd w:val="clear" w:color="auto" w:fill="C6D9F1" w:themeFill="text2" w:themeFillTint="33"/>
+            <w:vAlign w:val="center"/>
+          </w:tcPr>
+          <w:p>
+            <w:pPr>
+              <w:spacing w:after="40"/>
+            </w:pPr>
+            <w:r>
+              <w:rPr>
+                <w:sz w:val="16"/>
+              </w:rPr>
+              <w:t>UsuarioRepository</w:t>
+            </w:r>
+          </w:p>
+        </w:tc>
+        <w:tc>
+          <w:tcPr>
+            <w:tcW w:w="3345" w:type="dxa"/>
+            <w:shd w:val="clear" w:color="auto" w:fill="C6D9F1" w:themeFill="text2" w:themeFillTint="33"/>
+            <w:vAlign w:val="center"/>
+          </w:tcPr>
+          <w:p>
+            <w:pPr>
+              <w:spacing w:after="40"/>
+            </w:pPr>
+            <w:r>
+              <w:rPr>
+                <w:sz w:val="16"/>
+              </w:rPr>
+              <w:t>Componente de acceso a datos.</w:t>
+            </w:r>
+          </w:p>
+        </w:tc>
+        <w:tc>
+          <w:tcPr>
+            <w:tcW w:w="3912" w:type="dxa"/>
+            <w:shd w:val="clear" w:color="auto" w:fill="C6D9F1" w:themeFill="text2" w:themeFillTint="33"/>
+            <w:vAlign w:val="center"/>
+          </w:tcPr>
+          <w:p>
+            <w:pPr>
+              <w:spacing w:after="40"/>
+            </w:pPr>
+            <w:r>
+              <w:rPr>
+                <w:sz w:val="16"/>
+              </w:rPr>
+              <w:t>Consultar la información del usuario almacenada en PostgreSQL.</w:t>
+            </w:r>
+          </w:p>
+        </w:tc>
+      </w:tr>
+      <w:tr>
+        <w:trPr>
+          <w:jc w:val="center"/>
+        </w:trPr>
+        <w:tc>
+          <w:tcPr>
+            <w:tcW w:w="1928" w:type="dxa"/>
+            <w:shd w:val="clear" w:color="auto" w:fill="C6D9F1" w:themeFill="text2" w:themeFillTint="33"/>
+            <w:vAlign w:val="center"/>
+          </w:tcPr>
+          <w:p>
+            <w:pPr>
+              <w:spacing w:after="40"/>
+            </w:pPr>
+            <w:r>
+              <w:rPr>
+                <w:sz w:val="16"/>
+              </w:rPr>
+              <w:lastRenderedPageBreak/>
+              <w:t>PostgreSQL</w:t>
+            </w:r>
+          </w:p>
+        </w:tc>
+        <w:tc>
+          <w:tcPr>
+            <w:tcW w:w="3345" w:type="dxa"/>
+            <w:shd w:val="clear" w:color="auto" w:fill="C6D9F1" w:themeFill="text2" w:themeFillTint="33"/>
+            <w:vAlign w:val="center"/>
+          </w:tcPr>
+          <w:p>
+            <w:pPr>
+              <w:spacing w:after="40"/>
+            </w:pPr>
+            <w:r>
+              <w:rPr>
+                <w:sz w:val="16"/>
+              </w:rPr>
+              <w:t>Sistema gestor de base de datos relacional.</w:t>
+            </w:r>
+          </w:p>
+        </w:tc>
+        <w:tc>
+          <w:tcPr>
+            <w:tcW w:w="3912" w:type="dxa"/>
+            <w:shd w:val="clear" w:color="auto" w:fill="C6D9F1" w:themeFill="text2" w:themeFillTint="33"/>
+            <w:vAlign w:val="center"/>
+          </w:tcPr>
+          <w:p>
+            <w:pPr>
+              <w:spacing w:after="40"/>
+            </w:pPr>
+            <w:r>
+              <w:rPr>
+                <w:sz w:val="16"/>
+              </w:rPr>
+              <w:t>Almacenar usuarios, roles y contraseñas protegidas mediante hash.</w:t>
+            </w:r>
+          </w:p>
+        </w:tc>
+      </w:tr>
+    </w:tbl>
+    <w:p>
+      <w:pPr>
+        <w:rPr>
+          <w:rFonts w:ascii="Arial" w:hAnsi="Arial" w:cs="Arial"/>
+          <w:color w:val="1F497D" w:themeColor="text2"/>
+          <w:lang w:eastAsia="es-ES"/>
+        </w:rPr>
+      </w:pPr>
+    </w:p>
+    <w:p>
+      <w:pPr>
+        <w:pStyle w:val="Ttulo4"/>
+        <w:rPr>
+          <w:rFonts w:ascii="Arial" w:hAnsi="Arial" w:cs="Arial"/>
+          <w:b/>
+          <w:bCs/>
+          <w:i w:val="0"/>
+          <w:iCs w:val="0"/>
+          <w:sz w:val="24"/>
+          <w:szCs w:val="24"/>
+          <w:lang w:eastAsia="es-ES"/>
+        </w:rPr>
+      </w:pPr>
+      <w:r>
+        <w:rPr>
+          <w:rFonts w:ascii="Arial" w:hAnsi="Arial" w:cs="Arial"/>
+          <w:b/>
+          <w:bCs/>
+          <w:i w:val="0"/>
+          <w:iCs w:val="0"/>
+          <w:sz w:val="24"/>
+          <w:szCs w:val="24"/>
+          <w:lang w:eastAsia="es-ES"/>
+        </w:rPr>
+        <w:t>Diccionario de mensajes</w:t>
+      </w:r>
+    </w:p>
+    <w:tbl>
+      <w:tblPr>
+        <w:tblStyle w:val="Tablaconcuadrcula"/>
+        <w:tblW w:w="0" w:type="auto"/>
+        <w:jc w:val="center"/>
+        <w:tblLook w:val="04A0" w:firstRow="1" w:lastRow="0" w:firstColumn="1" w:lastColumn="0" w:noHBand="0" w:noVBand="1"/>
+      </w:tblPr>
+      <w:tblGrid>
+        <w:gridCol w:w="489"/>
+        <w:gridCol w:w="2414"/>
+        <w:gridCol w:w="2615"/>
+        <w:gridCol w:w="3536"/>
+      </w:tblGrid>
+      <w:tr>
+        <w:trPr>
+          <w:tblHeader/>
+          <w:jc w:val="center"/>
+        </w:trPr>
+        <w:tc>
+          <w:tcPr>
+            <w:tcW w:w="454" w:type="dxa"/>
+            <w:shd w:val="clear" w:color="auto" w:fill="1F497D" w:themeFill="text2"/>
+            <w:vAlign w:val="center"/>
+          </w:tcPr>
+          <w:p>
+            <w:pPr>
+              <w:spacing w:after="40"/>
+              <w:rPr>
+                <w:color w:val="FFFFFF" w:themeColor="background1"/>
+                <w:sz w:val="20"/>
+                <w:szCs w:val="28"/>
+              </w:rPr>
+            </w:pPr>
+            <w:r>
+              <w:rPr>
+                <w:b/>
+                <w:color w:val="FFFFFF" w:themeColor="background1"/>
+                <w:sz w:val="20"/>
+                <w:szCs w:val="28"/>
+              </w:rPr>
+              <w:t>N.º</w:t>
+            </w:r>
+          </w:p>
+        </w:tc>
+        <w:tc>
+          <w:tcPr>
+            <w:tcW w:w="2438" w:type="dxa"/>
+            <w:shd w:val="clear" w:color="auto" w:fill="1F497D" w:themeFill="text2"/>
+            <w:vAlign w:val="center"/>
+          </w:tcPr>
+          <w:p>
+            <w:pPr>
+              <w:spacing w:after="40"/>
+              <w:rPr>
+                <w:color w:val="FFFFFF" w:themeColor="background1"/>
+                <w:sz w:val="20"/>
+                <w:szCs w:val="28"/>
+              </w:rPr>
+            </w:pPr>
+            <w:r>
+              <w:rPr>
+                <w:b/>
+                <w:color w:val="FFFFFF" w:themeColor="background1"/>
+                <w:sz w:val="20"/>
+                <w:szCs w:val="28"/>
+              </w:rPr>
+              <w:t>Mensaje</w:t>
+            </w:r>
+          </w:p>
+        </w:tc>
+        <w:tc>
+          <w:tcPr>
+            <w:tcW w:w="2665" w:type="dxa"/>
+            <w:shd w:val="clear" w:color="auto" w:fill="1F497D" w:themeFill="text2"/>
+            <w:vAlign w:val="center"/>
+          </w:tcPr>
+          <w:p>
+            <w:pPr>
+              <w:spacing w:after="40"/>
+              <w:rPr>
+                <w:color w:val="FFFFFF" w:themeColor="background1"/>
+                <w:sz w:val="20"/>
+                <w:szCs w:val="28"/>
+              </w:rPr>
+            </w:pPr>
+            <w:r>
+              <w:rPr>
+                <w:b/>
+                <w:color w:val="FFFFFF" w:themeColor="background1"/>
+                <w:sz w:val="20"/>
+                <w:szCs w:val="28"/>
+              </w:rPr>
+              <w:t>Origen → Destino</w:t>
+            </w:r>
+          </w:p>
+        </w:tc>
+        <w:tc>
+          <w:tcPr>
+            <w:tcW w:w="3628" w:type="dxa"/>
+            <w:shd w:val="clear" w:color="auto" w:fill="1F497D" w:themeFill="text2"/>
+            <w:vAlign w:val="center"/>
+          </w:tcPr>
+          <w:p>
+            <w:pPr>
+              <w:spacing w:after="40"/>
+              <w:rPr>
+                <w:color w:val="FFFFFF" w:themeColor="background1"/>
+                <w:sz w:val="20"/>
+                <w:szCs w:val="28"/>
+              </w:rPr>
+            </w:pPr>
+            <w:r>
+              <w:rPr>
+                <w:b/>
+                <w:color w:val="FFFFFF" w:themeColor="background1"/>
+                <w:sz w:val="20"/>
+                <w:szCs w:val="28"/>
+              </w:rPr>
+              <w:t>Descripción</w:t>
+            </w:r>
+          </w:p>
+        </w:tc>
+      </w:tr>
+      <w:tr>
+        <w:trPr>
+          <w:jc w:val="center"/>
+        </w:trPr>
+        <w:tc>
+          <w:tcPr>
+            <w:tcW w:w="454" w:type="dxa"/>
+            <w:shd w:val="clear" w:color="auto" w:fill="1F497D" w:themeFill="text2"/>
+            <w:vAlign w:val="center"/>
+          </w:tcPr>
+          <w:p>
+            <w:pPr>
+              <w:spacing w:after="40"/>
+              <w:rPr>
+                <w:color w:val="FFFFFF" w:themeColor="background1"/>
+                <w:sz w:val="20"/>
+                <w:szCs w:val="28"/>
+              </w:rPr>
+            </w:pPr>
+            <w:r>
+              <w:rPr>
+                <w:color w:val="FFFFFF" w:themeColor="background1"/>
+                <w:sz w:val="20"/>
+                <w:szCs w:val="28"/>
+              </w:rPr>
+              <w:t>1</w:t>
+            </w:r>
+          </w:p>
+        </w:tc>
+        <w:tc>
+          <w:tcPr>
+            <w:tcW w:w="2438" w:type="dxa"/>
+            <w:shd w:val="clear" w:color="auto" w:fill="C6D9F1" w:themeFill="text2" w:themeFillTint="33"/>
+            <w:vAlign w:val="center"/>
+          </w:tcPr>
+          <w:p>
+            <w:pPr>
+              <w:spacing w:after="40"/>
+            </w:pPr>
+            <w:r>
+              <w:rPr>
+                <w:sz w:val="16"/>
+              </w:rPr>
+              <w:t>Ingresar credenciales</w:t>
+            </w:r>
+          </w:p>
+        </w:tc>
+        <w:tc>
+          <w:tcPr>
+            <w:tcW w:w="2665" w:type="dxa"/>
+            <w:shd w:val="clear" w:color="auto" w:fill="C6D9F1" w:themeFill="text2" w:themeFillTint="33"/>
+            <w:vAlign w:val="center"/>
+          </w:tcPr>
+          <w:p>
+            <w:pPr>
+              <w:spacing w:after="40"/>
+            </w:pPr>
+            <w:r>
+              <w:rPr>
+                <w:sz w:val="16"/>
+              </w:rPr>
+              <w:t>Usuario → Frontend</w:t>
+            </w:r>
+          </w:p>
+        </w:tc>
+        <w:tc>
+          <w:tcPr>
+            <w:tcW w:w="3628" w:type="dxa"/>
+            <w:shd w:val="clear" w:color="auto" w:fill="C6D9F1" w:themeFill="text2" w:themeFillTint="33"/>
+            <w:vAlign w:val="center"/>
+          </w:tcPr>
+          <w:p>
+            <w:pPr>
+              <w:spacing w:after="40"/>
+            </w:pPr>
+            <w:r>
+              <w:rPr>
+                <w:sz w:val="16"/>
+              </w:rPr>
+              <w:t>El usuario introduce su correo electrónico y contraseña.</w:t>
+            </w:r>
+          </w:p>
+        </w:tc>
+      </w:tr>
+      <w:tr>
+        <w:trPr>
+          <w:jc w:val="center"/>
+        </w:trPr>
+        <w:tc>
+          <w:tcPr>
+            <w:tcW w:w="454" w:type="dxa"/>
+            <w:shd w:val="clear" w:color="auto" w:fill="1F497D" w:themeFill="text2"/>
+            <w:vAlign w:val="center"/>
+          </w:tcPr>
+          <w:p>
+            <w:pPr>
+              <w:spacing w:after="40"/>
+              <w:rPr>
+                <w:color w:val="FFFFFF" w:themeColor="background1"/>
+                <w:sz w:val="20"/>
+                <w:szCs w:val="28"/>
+              </w:rPr>
+            </w:pPr>
+            <w:r>
+              <w:rPr>
+                <w:color w:val="FFFFFF" w:themeColor="background1"/>
+                <w:sz w:val="20"/>
+                <w:szCs w:val="28"/>
+              </w:rPr>
+              <w:t>2</w:t>
+            </w:r>
+          </w:p>
+        </w:tc>
+        <w:tc>
+          <w:tcPr>
+            <w:tcW w:w="2438" w:type="dxa"/>
+            <w:shd w:val="clear" w:color="auto" w:fill="C6D9F1" w:themeFill="text2" w:themeFillTint="33"/>
+            <w:vAlign w:val="center"/>
+          </w:tcPr>
+          <w:p>
+            <w:pPr>
+              <w:spacing w:after="40"/>
+            </w:pPr>
+            <w:r>
+              <w:rPr>
+                <w:sz w:val="16"/>
+              </w:rPr>
+              <w:t>Iniciar sesión</w:t>
+            </w:r>
+          </w:p>
+        </w:tc>
+        <w:tc>
+          <w:tcPr>
+            <w:tcW w:w="2665" w:type="dxa"/>
+            <w:shd w:val="clear" w:color="auto" w:fill="C6D9F1" w:themeFill="text2" w:themeFillTint="33"/>
+            <w:vAlign w:val="center"/>
+          </w:tcPr>
+          <w:p>
+            <w:pPr>
+              <w:spacing w:after="40"/>
+            </w:pPr>
+            <w:r>
+              <w:rPr>
+                <w:sz w:val="16"/>
+              </w:rPr>
+              <w:t>Usuario → Frontend</w:t>
+            </w:r>
+          </w:p>
+        </w:tc>
+        <w:tc>
+          <w:tcPr>
+            <w:tcW w:w="3628" w:type="dxa"/>
+            <w:shd w:val="clear" w:color="auto" w:fill="C6D9F1" w:themeFill="text2" w:themeFillTint="33"/>
+            <w:vAlign w:val="center"/>
+          </w:tcPr>
+          <w:p>
+            <w:pPr>
+              <w:spacing w:after="40"/>
+            </w:pPr>
+            <w:r>
+              <w:rPr>
+                <w:sz w:val="16"/>
+              </w:rPr>
+              <w:t>El usuario envía el formulario de autenticación.</w:t>
+            </w:r>
+          </w:p>
+        </w:tc>
+      </w:tr>
+      <w:tr>
+        <w:trPr>
+          <w:jc w:val="center"/>
+        </w:trPr>
+        <w:tc>
+          <w:tcPr>
+            <w:tcW w:w="454" w:type="dxa"/>
+            <w:shd w:val="clear" w:color="auto" w:fill="1F497D" w:themeFill="text2"/>
+            <w:vAlign w:val="center"/>
+          </w:tcPr>
+          <w:p>
+            <w:pPr>
+              <w:spacing w:after="40"/>
+              <w:rPr>
+                <w:color w:val="FFFFFF" w:themeColor="background1"/>
+                <w:sz w:val="20"/>
+                <w:szCs w:val="28"/>
+              </w:rPr>
+            </w:pPr>
+            <w:r>
+              <w:rPr>
+                <w:color w:val="FFFFFF" w:themeColor="background1"/>
+                <w:sz w:val="20"/>
+                <w:szCs w:val="28"/>
+              </w:rPr>
+              <w:t>3</w:t>
+            </w:r>
+          </w:p>
+        </w:tc>
+        <w:tc>
+          <w:tcPr>
+            <w:tcW w:w="2438" w:type="dxa"/>
+            <w:shd w:val="clear" w:color="auto" w:fill="C6D9F1" w:themeFill="text2" w:themeFillTint="33"/>
+            <w:vAlign w:val="center"/>
+          </w:tcPr>
+          <w:p>
+            <w:pPr>
+              <w:spacing w:after="40"/>
+            </w:pPr>
+            <w:r>
+              <w:rPr>
+                <w:sz w:val="16"/>
+              </w:rPr>
+              <w:t>POST /api/auth/login</w:t>
+            </w:r>
+          </w:p>
+        </w:tc>
+        <w:tc>
+          <w:tcPr>
+            <w:tcW w:w="2665" w:type="dxa"/>
+            <w:shd w:val="clear" w:color="auto" w:fill="C6D9F1" w:themeFill="text2" w:themeFillTint="33"/>
+            <w:vAlign w:val="center"/>
+          </w:tcPr>
+          <w:p>
+            <w:pPr>
+              <w:spacing w:after="40"/>
+            </w:pPr>
+            <w:r>
+              <w:rPr>
+                <w:sz w:val="16"/>
+              </w:rPr>
+              <w:t>Frontend → Ruta Express</w:t>
+            </w:r>
+          </w:p>
+        </w:tc>
+        <w:tc>
+          <w:tcPr>
+            <w:tcW w:w="3628" w:type="dxa"/>
+            <w:shd w:val="clear" w:color="auto" w:fill="C6D9F1" w:themeFill="text2" w:themeFillTint="33"/>
+            <w:vAlign w:val="center"/>
+          </w:tcPr>
+          <w:p>
+            <w:pPr>
+              <w:spacing w:after="40"/>
+            </w:pPr>
+            <w:r>
+              <w:rPr>
+                <w:sz w:val="16"/>
+              </w:rPr>
+              <w:t>Envía las credenciales al backend mediante una solicitud HTTP.</w:t>
+            </w:r>
+          </w:p>
+        </w:tc>
+      </w:tr>
+      <w:tr>
+        <w:trPr>
+          <w:jc w:val="center"/>
+        </w:trPr>
+        <w:tc>
+          <w:tcPr>
+            <w:tcW w:w="454" w:type="dxa"/>
+            <w:shd w:val="clear" w:color="auto" w:fill="1F497D" w:themeFill="text2"/>
+            <w:vAlign w:val="center"/>
+          </w:tcPr>
+          <w:p>
+            <w:pPr>
+              <w:spacing w:after="40"/>
+              <w:rPr>
+                <w:color w:val="FFFFFF" w:themeColor="background1"/>
+                <w:sz w:val="20"/>
+                <w:szCs w:val="28"/>
+              </w:rPr>
+            </w:pPr>
+            <w:r>
+              <w:rPr>
+                <w:color w:val="FFFFFF" w:themeColor="background1"/>
+                <w:sz w:val="20"/>
+                <w:szCs w:val="28"/>
+              </w:rPr>
+              <w:t>4</w:t>
+            </w:r>
+          </w:p>
+        </w:tc>
+        <w:tc>
+          <w:tcPr>
+            <w:tcW w:w="2438" w:type="dxa"/>
+            <w:shd w:val="clear" w:color="auto" w:fill="C6D9F1" w:themeFill="text2" w:themeFillTint="33"/>
+            <w:vAlign w:val="center"/>
+          </w:tcPr>
+          <w:p>
+            <w:pPr>
+              <w:spacing w:after="40"/>
+            </w:pPr>
+            <w:r>
+              <w:rPr>
+                <w:sz w:val="16"/>
+              </w:rPr>
+              <w:t>iniciarSesion</w:t>
+            </w:r>
+            <w:r>
+              <w:rPr>
+                <w:sz w:val="16"/>
+              </w:rPr>
+              <w:t xml:space="preserve"> </w:t>
+            </w:r>
+            <w:r>
+              <w:rPr>
+                <w:sz w:val="16"/>
+              </w:rPr>
+              <w:t>(req, res)</w:t>
+            </w:r>
+          </w:p>
+        </w:tc>
+        <w:tc>
+          <w:tcPr>
+            <w:tcW w:w="2665" w:type="dxa"/>
+            <w:shd w:val="clear" w:color="auto" w:fill="C6D9F1" w:themeFill="text2" w:themeFillTint="33"/>
+            <w:vAlign w:val="center"/>
+          </w:tcPr>
+          <w:p>
+            <w:pPr>
+              <w:spacing w:after="40"/>
+            </w:pPr>
+            <w:r>
+              <w:rPr>
+                <w:sz w:val="16"/>
+              </w:rPr>
+              <w:t>Ruta Express → AuthController</w:t>
+            </w:r>
+          </w:p>
+        </w:tc>
+        <w:tc>
+          <w:tcPr>
+            <w:tcW w:w="3628" w:type="dxa"/>
+            <w:shd w:val="clear" w:color="auto" w:fill="C6D9F1" w:themeFill="text2" w:themeFillTint="33"/>
+            <w:vAlign w:val="center"/>
+          </w:tcPr>
+          <w:p>
+            <w:pPr>
+              <w:spacing w:after="40"/>
+            </w:pPr>
+            <w:r>
+              <w:rPr>
+                <w:sz w:val="16"/>
+              </w:rPr>
+              <w:t>Invoca el controlador encargado del inicio de sesión.</w:t>
+            </w:r>
+          </w:p>
+        </w:tc>
+      </w:tr>
+      <w:tr>
+        <w:trPr>
+          <w:jc w:val="center"/>
+        </w:trPr>
+        <w:tc>
+          <w:tcPr>
+            <w:tcW w:w="454" w:type="dxa"/>
+            <w:shd w:val="clear" w:color="auto" w:fill="1F497D" w:themeFill="text2"/>
+            <w:vAlign w:val="center"/>
+          </w:tcPr>
+          <w:p>
+            <w:pPr>
+              <w:spacing w:after="40"/>
+              <w:rPr>
+                <w:color w:val="FFFFFF" w:themeColor="background1"/>
+                <w:sz w:val="20"/>
+                <w:szCs w:val="28"/>
+              </w:rPr>
+            </w:pPr>
+            <w:r>
+              <w:rPr>
+                <w:color w:val="FFFFFF" w:themeColor="background1"/>
+                <w:sz w:val="20"/>
+                <w:szCs w:val="28"/>
+              </w:rPr>
+              <w:t>5</w:t>
+            </w:r>
+          </w:p>
+        </w:tc>
+        <w:tc>
+          <w:tcPr>
+            <w:tcW w:w="2438" w:type="dxa"/>
+            <w:shd w:val="clear" w:color="auto" w:fill="C6D9F1" w:themeFill="text2" w:themeFillTint="33"/>
+            <w:vAlign w:val="center"/>
+          </w:tcPr>
+          <w:p>
+            <w:pPr>
+              <w:spacing w:after="40"/>
+            </w:pPr>
+            <w:r>
+              <w:rPr>
+                <w:sz w:val="16"/>
+              </w:rPr>
+              <w:t>autenticar (</w:t>
+            </w:r>
+            <w:r>
+              <w:rPr>
+                <w:sz w:val="16"/>
+              </w:rPr>
+              <w:t>correo, contraseña)</w:t>
+            </w:r>
+          </w:p>
+        </w:tc>
+        <w:tc>
+          <w:tcPr>
+            <w:tcW w:w="2665" w:type="dxa"/>
+            <w:shd w:val="clear" w:color="auto" w:fill="C6D9F1" w:themeFill="text2" w:themeFillTint="33"/>
+            <w:vAlign w:val="center"/>
+          </w:tcPr>
+          <w:p>
+            <w:pPr>
+              <w:spacing w:after="40"/>
+            </w:pPr>
+            <w:r>
+              <w:rPr>
+                <w:sz w:val="16"/>
+              </w:rPr>
+              <w:t>AuthController → AuthService</w:t>
+            </w:r>
+          </w:p>
+        </w:tc>
+        <w:tc>
+          <w:tcPr>
+            <w:tcW w:w="3628" w:type="dxa"/>
+            <w:shd w:val="clear" w:color="auto" w:fill="C6D9F1" w:themeFill="text2" w:themeFillTint="33"/>
+            <w:vAlign w:val="center"/>
+          </w:tcPr>
+          <w:p>
+            <w:pPr>
+              <w:spacing w:after="40"/>
+            </w:pPr>
+            <w:r>
+              <w:rPr>
+                <w:sz w:val="16"/>
+              </w:rPr>
+              <w:t>Solicita la validación de las credenciales ingresadas.</w:t>
+            </w:r>
+          </w:p>
+        </w:tc>
+      </w:tr>
+      <w:tr>
+        <w:trPr>
+          <w:jc w:val="center"/>
+        </w:trPr>
+        <w:tc>
+          <w:tcPr>
+            <w:tcW w:w="454" w:type="dxa"/>
+            <w:shd w:val="clear" w:color="auto" w:fill="1F497D" w:themeFill="text2"/>
+            <w:vAlign w:val="center"/>
+          </w:tcPr>
+          <w:p>
+            <w:pPr>
+              <w:spacing w:after="40"/>
+              <w:rPr>
+                <w:color w:val="FFFFFF" w:themeColor="background1"/>
+                <w:sz w:val="20"/>
+                <w:szCs w:val="28"/>
+              </w:rPr>
+            </w:pPr>
+            <w:r>
+              <w:rPr>
+                <w:color w:val="FFFFFF" w:themeColor="background1"/>
+                <w:sz w:val="20"/>
+                <w:szCs w:val="28"/>
+              </w:rPr>
+              <w:t>6</w:t>
+            </w:r>
+          </w:p>
+        </w:tc>
+        <w:tc>
+          <w:tcPr>
+            <w:tcW w:w="2438" w:type="dxa"/>
+            <w:shd w:val="clear" w:color="auto" w:fill="C6D9F1" w:themeFill="text2" w:themeFillTint="33"/>
+            <w:vAlign w:val="center"/>
+          </w:tcPr>
+          <w:p>
+            <w:pPr>
+              <w:spacing w:after="40"/>
+            </w:pPr>
+            <w:r>
+              <w:rPr>
+                <w:sz w:val="16"/>
+              </w:rPr>
+              <w:t>buscarPorCorreo(correo)</w:t>
+            </w:r>
+          </w:p>
+        </w:tc>
+        <w:tc>
+          <w:tcPr>
+            <w:tcW w:w="2665" w:type="dxa"/>
+            <w:shd w:val="clear" w:color="auto" w:fill="C6D9F1" w:themeFill="text2" w:themeFillTint="33"/>
+            <w:vAlign w:val="center"/>
+          </w:tcPr>
+          <w:p>
+            <w:pPr>
+              <w:spacing w:after="40"/>
+            </w:pPr>
+            <w:r>
+              <w:rPr>
+                <w:sz w:val="16"/>
+              </w:rPr>
+              <w:t>AuthService → UsuarioRepository</w:t>
+            </w:r>
+          </w:p>
+        </w:tc>
+        <w:tc>
+          <w:tcPr>
+            <w:tcW w:w="3628" w:type="dxa"/>
+            <w:shd w:val="clear" w:color="auto" w:fill="C6D9F1" w:themeFill="text2" w:themeFillTint="33"/>
+            <w:vAlign w:val="center"/>
+          </w:tcPr>
+          <w:p>
+            <w:pPr>
+              <w:spacing w:after="40"/>
+            </w:pPr>
+            <w:r>
+              <w:rPr>
+                <w:sz w:val="16"/>
+              </w:rPr>
+              <w:t>Solicita la búsqueda del usuario mediante su correo electrónico.</w:t>
+            </w:r>
+          </w:p>
+        </w:tc>
+      </w:tr>
+      <w:tr>
+        <w:trPr>
+          <w:jc w:val="center"/>
+        </w:trPr>
+        <w:tc>
+          <w:tcPr>
+            <w:tcW w:w="454" w:type="dxa"/>
+            <w:shd w:val="clear" w:color="auto" w:fill="1F497D" w:themeFill="text2"/>
+            <w:vAlign w:val="center"/>
+          </w:tcPr>
+          <w:p>
+            <w:pPr>
+              <w:spacing w:after="40"/>
+              <w:rPr>
+                <w:color w:val="FFFFFF" w:themeColor="background1"/>
+                <w:sz w:val="20"/>
+                <w:szCs w:val="28"/>
+              </w:rPr>
+            </w:pPr>
+            <w:r>
+              <w:rPr>
+                <w:color w:val="FFFFFF" w:themeColor="background1"/>
+                <w:sz w:val="20"/>
+                <w:szCs w:val="28"/>
+              </w:rPr>
+              <w:t>7</w:t>
+            </w:r>
+          </w:p>
+        </w:tc>
+        <w:tc>
+          <w:tcPr>
+            <w:tcW w:w="2438" w:type="dxa"/>
+            <w:shd w:val="clear" w:color="auto" w:fill="C6D9F1" w:themeFill="text2" w:themeFillTint="33"/>
+            <w:vAlign w:val="center"/>
+          </w:tcPr>
+          <w:p>
+            <w:pPr>
+              <w:spacing w:after="40"/>
+            </w:pPr>
+            <w:r>
+              <w:rPr>
+                <w:sz w:val="16"/>
+              </w:rPr>
+              <w:t>SELECT usuario y rol</w:t>
+            </w:r>
+          </w:p>
+        </w:tc>
+        <w:tc>
+          <w:tcPr>
+            <w:tcW w:w="2665" w:type="dxa"/>
+            <w:shd w:val="clear" w:color="auto" w:fill="C6D9F1" w:themeFill="text2" w:themeFillTint="33"/>
+            <w:vAlign w:val="center"/>
+          </w:tcPr>
+          <w:p>
+            <w:pPr>
+              <w:spacing w:after="40"/>
+            </w:pPr>
+            <w:r>
+              <w:rPr>
+                <w:sz w:val="16"/>
+              </w:rPr>
+              <w:t>UsuarioRepository → PostgreSQL</w:t>
+            </w:r>
+          </w:p>
+        </w:tc>
+        <w:tc>
+          <w:tcPr>
+            <w:tcW w:w="3628" w:type="dxa"/>
+            <w:shd w:val="clear" w:color="auto" w:fill="C6D9F1" w:themeFill="text2" w:themeFillTint="33"/>
+            <w:vAlign w:val="center"/>
+          </w:tcPr>
+          <w:p>
+            <w:pPr>
+              <w:spacing w:after="40"/>
+            </w:pPr>
+            <w:r>
+              <w:rPr>
+                <w:sz w:val="16"/>
+              </w:rPr>
+              <w:t>Consulta los datos del usuario y su rol asociado.</w:t>
+            </w:r>
+          </w:p>
+        </w:tc>
+      </w:tr>
+      <w:tr>
+        <w:trPr>
+          <w:jc w:val="center"/>
+        </w:trPr>
+        <w:tc>
+          <w:tcPr>
+            <w:tcW w:w="454" w:type="dxa"/>
+            <w:shd w:val="clear" w:color="auto" w:fill="1F497D" w:themeFill="text2"/>
+            <w:vAlign w:val="center"/>
+          </w:tcPr>
+          <w:p>
+            <w:pPr>
+              <w:spacing w:after="40"/>
+              <w:rPr>
+                <w:color w:val="FFFFFF" w:themeColor="background1"/>
+                <w:sz w:val="20"/>
+                <w:szCs w:val="28"/>
+              </w:rPr>
+            </w:pPr>
+            <w:r>
+              <w:rPr>
+                <w:color w:val="FFFFFF" w:themeColor="background1"/>
+                <w:sz w:val="20"/>
+                <w:szCs w:val="28"/>
+              </w:rPr>
+              <w:t>8</w:t>
+            </w:r>
+          </w:p>
+        </w:tc>
+        <w:tc>
+          <w:tcPr>
+            <w:tcW w:w="2438" w:type="dxa"/>
+            <w:shd w:val="clear" w:color="auto" w:fill="C6D9F1" w:themeFill="text2" w:themeFillTint="33"/>
+            <w:vAlign w:val="center"/>
+          </w:tcPr>
+          <w:p>
+            <w:pPr>
+              <w:spacing w:after="40"/>
+            </w:pPr>
+            <w:r>
+              <w:rPr>
+                <w:sz w:val="16"/>
+              </w:rPr>
+              <w:t>Datos del usuario</w:t>
+            </w:r>
+          </w:p>
+        </w:tc>
+        <w:tc>
+          <w:tcPr>
+            <w:tcW w:w="2665" w:type="dxa"/>
+            <w:shd w:val="clear" w:color="auto" w:fill="C6D9F1" w:themeFill="text2" w:themeFillTint="33"/>
+            <w:vAlign w:val="center"/>
+          </w:tcPr>
+          <w:p>
+            <w:pPr>
+              <w:spacing w:after="40"/>
+            </w:pPr>
+            <w:r>
+              <w:rPr>
+                <w:sz w:val="16"/>
+              </w:rPr>
+              <w:t>PostgreSQL → UsuarioRepository</w:t>
+            </w:r>
+          </w:p>
+        </w:tc>
+        <w:tc>
+          <w:tcPr>
+            <w:tcW w:w="3628" w:type="dxa"/>
+            <w:shd w:val="clear" w:color="auto" w:fill="C6D9F1" w:themeFill="text2" w:themeFillTint="33"/>
+            <w:vAlign w:val="center"/>
+          </w:tcPr>
+          <w:p>
+            <w:pPr>
+              <w:spacing w:after="40"/>
+            </w:pPr>
+            <w:r>
+              <w:rPr>
+                <w:sz w:val="16"/>
+              </w:rPr>
+              <w:t>Devuelve los datos correspondientes al usuario consultado.</w:t>
+            </w:r>
+          </w:p>
+        </w:tc>
+      </w:tr>
+      <w:tr>
+        <w:trPr>
+          <w:jc w:val="center"/>
+        </w:trPr>
+        <w:tc>
+          <w:tcPr>
+            <w:tcW w:w="454" w:type="dxa"/>
+            <w:shd w:val="clear" w:color="auto" w:fill="1F497D" w:themeFill="text2"/>
+            <w:vAlign w:val="center"/>
+          </w:tcPr>
+          <w:p>
+            <w:pPr>
+              <w:spacing w:after="40"/>
+              <w:rPr>
+                <w:color w:val="FFFFFF" w:themeColor="background1"/>
+                <w:sz w:val="20"/>
+                <w:szCs w:val="28"/>
+              </w:rPr>
+            </w:pPr>
+            <w:r>
+              <w:rPr>
+                <w:color w:val="FFFFFF" w:themeColor="background1"/>
+                <w:sz w:val="20"/>
+                <w:szCs w:val="28"/>
+              </w:rPr>
+              <w:t>9</w:t>
+            </w:r>
+          </w:p>
+        </w:tc>
+        <w:tc>
+          <w:tcPr>
+            <w:tcW w:w="2438" w:type="dxa"/>
+            <w:shd w:val="clear" w:color="auto" w:fill="C6D9F1" w:themeFill="text2" w:themeFillTint="33"/>
+            <w:vAlign w:val="center"/>
+          </w:tcPr>
+          <w:p>
+            <w:pPr>
+              <w:spacing w:after="40"/>
+            </w:pPr>
+            <w:r>
+              <w:rPr>
+                <w:sz w:val="16"/>
+              </w:rPr>
+              <w:t>Usuario encontrado</w:t>
+            </w:r>
+          </w:p>
+        </w:tc>
+        <w:tc>
+          <w:tcPr>
+            <w:tcW w:w="2665" w:type="dxa"/>
+            <w:shd w:val="clear" w:color="auto" w:fill="C6D9F1" w:themeFill="text2" w:themeFillTint="33"/>
+            <w:vAlign w:val="center"/>
+          </w:tcPr>
+          <w:p>
+            <w:pPr>
+              <w:spacing w:after="40"/>
+            </w:pPr>
+            <w:r>
+              <w:rPr>
+                <w:sz w:val="16"/>
+              </w:rPr>
+              <w:t>UsuarioRepository → AuthService</w:t>
+            </w:r>
+          </w:p>
+        </w:tc>
+        <w:tc>
+          <w:tcPr>
+            <w:tcW w:w="3628" w:type="dxa"/>
+            <w:shd w:val="clear" w:color="auto" w:fill="C6D9F1" w:themeFill="text2" w:themeFillTint="33"/>
+            <w:vAlign w:val="center"/>
+          </w:tcPr>
+          <w:p>
+            <w:pPr>
+              <w:spacing w:after="40"/>
+            </w:pPr>
+            <w:r>
+              <w:rPr>
+                <w:sz w:val="16"/>
+              </w:rPr>
+              <w:t>Entrega la información necesaria para validar la autenticación.</w:t>
+            </w:r>
+          </w:p>
+        </w:tc>
+      </w:tr>
+      <w:tr>
+        <w:trPr>
+          <w:jc w:val="center"/>
+        </w:trPr>
+        <w:tc>
+          <w:tcPr>
+            <w:tcW w:w="454" w:type="dxa"/>
+            <w:shd w:val="clear" w:color="auto" w:fill="1F497D" w:themeFill="text2"/>
+            <w:vAlign w:val="center"/>
+          </w:tcPr>
+          <w:p>
+            <w:pPr>
+              <w:spacing w:after="40"/>
+              <w:rPr>
+                <w:color w:val="FFFFFF" w:themeColor="background1"/>
+                <w:sz w:val="20"/>
+                <w:szCs w:val="28"/>
+              </w:rPr>
+            </w:pPr>
+            <w:r>
+              <w:rPr>
+                <w:color w:val="FFFFFF" w:themeColor="background1"/>
+                <w:sz w:val="20"/>
+                <w:szCs w:val="28"/>
+              </w:rPr>
+              <w:t>10</w:t>
+            </w:r>
+          </w:p>
+        </w:tc>
+        <w:tc>
+          <w:tcPr>
+            <w:tcW w:w="2438" w:type="dxa"/>
+            <w:shd w:val="clear" w:color="auto" w:fill="C6D9F1" w:themeFill="text2" w:themeFillTint="33"/>
+            <w:vAlign w:val="center"/>
+          </w:tcPr>
+          <w:p>
+            <w:pPr>
+              <w:spacing w:after="40"/>
+            </w:pPr>
+            <w:r>
+              <w:rPr>
+                <w:sz w:val="16"/>
+              </w:rPr>
+              <w:t>Verificar contraseña</w:t>
+            </w:r>
+          </w:p>
+        </w:tc>
+        <w:tc>
+          <w:tcPr>
+            <w:tcW w:w="2665" w:type="dxa"/>
+            <w:shd w:val="clear" w:color="auto" w:fill="C6D9F1" w:themeFill="text2" w:themeFillTint="33"/>
+            <w:vAlign w:val="center"/>
+          </w:tcPr>
+          <w:p>
+            <w:pPr>
+              <w:spacing w:after="40"/>
+            </w:pPr>
+            <w:r>
+              <w:rPr>
+                <w:sz w:val="16"/>
+              </w:rPr>
+              <w:t>AuthService → AuthService</w:t>
+            </w:r>
+          </w:p>
+        </w:tc>
+        <w:tc>
+          <w:tcPr>
+            <w:tcW w:w="3628" w:type="dxa"/>
+            <w:shd w:val="clear" w:color="auto" w:fill="C6D9F1" w:themeFill="text2" w:themeFillTint="33"/>
+            <w:vAlign w:val="center"/>
+          </w:tcPr>
+          <w:p>
+            <w:pPr>
+              <w:spacing w:after="40"/>
+            </w:pPr>
+            <w:r>
+              <w:rPr>
+                <w:sz w:val="16"/>
+              </w:rPr>
+              <w:t>Compara la contraseña ingresada con el hash almacenado utilizando bcrypt.</w:t>
+            </w:r>
+          </w:p>
+        </w:tc>
+      </w:tr>
+      <w:tr>
+        <w:trPr>
+          <w:jc w:val="center"/>
+        </w:trPr>
+        <w:tc>
+          <w:tcPr>
+            <w:tcW w:w="454" w:type="dxa"/>
+            <w:shd w:val="clear" w:color="auto" w:fill="1F497D" w:themeFill="text2"/>
+            <w:vAlign w:val="center"/>
+          </w:tcPr>
+          <w:p>
+            <w:pPr>
+              <w:spacing w:after="40"/>
+              <w:rPr>
+                <w:color w:val="FFFFFF" w:themeColor="background1"/>
+                <w:sz w:val="20"/>
+                <w:szCs w:val="28"/>
+              </w:rPr>
+            </w:pPr>
+            <w:r>
+              <w:rPr>
+                <w:color w:val="FFFFFF" w:themeColor="background1"/>
+                <w:sz w:val="20"/>
+                <w:szCs w:val="28"/>
+              </w:rPr>
+              <w:t>11</w:t>
+            </w:r>
+          </w:p>
+        </w:tc>
+        <w:tc>
+          <w:tcPr>
+            <w:tcW w:w="2438" w:type="dxa"/>
+            <w:shd w:val="clear" w:color="auto" w:fill="C6D9F1" w:themeFill="text2" w:themeFillTint="33"/>
+            <w:vAlign w:val="center"/>
+          </w:tcPr>
+          <w:p>
+            <w:pPr>
+              <w:spacing w:after="40"/>
+            </w:pPr>
+            <w:r>
+              <w:rPr>
+                <w:sz w:val="16"/>
+              </w:rPr>
+              <w:t>Usuario autenticado</w:t>
+            </w:r>
+          </w:p>
+        </w:tc>
+        <w:tc>
+          <w:tcPr>
+            <w:tcW w:w="2665" w:type="dxa"/>
+            <w:shd w:val="clear" w:color="auto" w:fill="C6D9F1" w:themeFill="text2" w:themeFillTint="33"/>
+            <w:vAlign w:val="center"/>
+          </w:tcPr>
+          <w:p>
+            <w:pPr>
+              <w:spacing w:after="40"/>
+            </w:pPr>
+            <w:r>
+              <w:rPr>
+                <w:sz w:val="16"/>
+              </w:rPr>
+              <w:t>AuthService → AuthController</w:t>
+            </w:r>
+          </w:p>
+        </w:tc>
+        <w:tc>
+          <w:tcPr>
+            <w:tcW w:w="3628" w:type="dxa"/>
+            <w:shd w:val="clear" w:color="auto" w:fill="C6D9F1" w:themeFill="text2" w:themeFillTint="33"/>
+            <w:vAlign w:val="center"/>
+          </w:tcPr>
+          <w:p>
+            <w:pPr>
+              <w:spacing w:after="40"/>
+            </w:pPr>
+            <w:r>
+              <w:rPr>
+                <w:sz w:val="16"/>
+              </w:rPr>
+              <w:t>Confirma que las credenciales son correctas y la cuenta está activa.</w:t>
+            </w:r>
+          </w:p>
+        </w:tc>
+      </w:tr>
+      <w:tr>
+        <w:trPr>
+          <w:jc w:val="center"/>
+        </w:trPr>
+        <w:tc>
+          <w:tcPr>
+            <w:tcW w:w="454" w:type="dxa"/>
+            <w:shd w:val="clear" w:color="auto" w:fill="1F497D" w:themeFill="text2"/>
+            <w:vAlign w:val="center"/>
+          </w:tcPr>
+          <w:p>
+            <w:pPr>
+              <w:spacing w:after="40"/>
+              <w:rPr>
+                <w:color w:val="FFFFFF" w:themeColor="background1"/>
+                <w:sz w:val="20"/>
+                <w:szCs w:val="28"/>
+              </w:rPr>
+            </w:pPr>
+            <w:r>
+              <w:rPr>
+                <w:color w:val="FFFFFF" w:themeColor="background1"/>
+                <w:sz w:val="20"/>
+                <w:szCs w:val="28"/>
+              </w:rPr>
+              <w:t>12</w:t>
+            </w:r>
+          </w:p>
+        </w:tc>
+        <w:tc>
+          <w:tcPr>
+            <w:tcW w:w="2438" w:type="dxa"/>
+            <w:shd w:val="clear" w:color="auto" w:fill="C6D9F1" w:themeFill="text2" w:themeFillTint="33"/>
+            <w:vAlign w:val="center"/>
+          </w:tcPr>
+          <w:p>
+            <w:pPr>
+              <w:spacing w:after="40"/>
+            </w:pPr>
+            <w:r>
+              <w:rPr>
+                <w:sz w:val="16"/>
+              </w:rPr>
+              <w:t>Crear sesión</w:t>
+            </w:r>
+          </w:p>
+        </w:tc>
+        <w:tc>
+          <w:tcPr>
+            <w:tcW w:w="2665" w:type="dxa"/>
+            <w:shd w:val="clear" w:color="auto" w:fill="C6D9F1" w:themeFill="text2" w:themeFillTint="33"/>
+            <w:vAlign w:val="center"/>
+          </w:tcPr>
+          <w:p>
+            <w:pPr>
+              <w:spacing w:after="40"/>
+            </w:pPr>
+            <w:r>
+              <w:rPr>
+                <w:sz w:val="16"/>
+              </w:rPr>
+              <w:t>AuthController → AuthController</w:t>
+            </w:r>
+          </w:p>
+        </w:tc>
+        <w:tc>
+          <w:tcPr>
+            <w:tcW w:w="3628" w:type="dxa"/>
+            <w:shd w:val="clear" w:color="auto" w:fill="C6D9F1" w:themeFill="text2" w:themeFillTint="33"/>
+            <w:vAlign w:val="center"/>
+          </w:tcPr>
+          <w:p>
+            <w:pPr>
+              <w:spacing w:after="40"/>
+            </w:pPr>
+            <w:r>
+              <w:rPr>
+                <w:sz w:val="16"/>
+              </w:rPr>
+              <w:t>Registra la información del usuario autenticado en la sesión.</w:t>
+            </w:r>
+          </w:p>
+        </w:tc>
+      </w:tr>
+      <w:tr>
+        <w:trPr>
+          <w:jc w:val="center"/>
+        </w:trPr>
+        <w:tc>
+          <w:tcPr>
+            <w:tcW w:w="454" w:type="dxa"/>
+            <w:shd w:val="clear" w:color="auto" w:fill="1F497D" w:themeFill="text2"/>
+            <w:vAlign w:val="center"/>
+          </w:tcPr>
+          <w:p>
+            <w:pPr>
+              <w:spacing w:after="40"/>
+              <w:rPr>
+                <w:color w:val="FFFFFF" w:themeColor="background1"/>
+                <w:sz w:val="20"/>
+                <w:szCs w:val="28"/>
+              </w:rPr>
+            </w:pPr>
+            <w:r>
+              <w:rPr>
+                <w:color w:val="FFFFFF" w:themeColor="background1"/>
+                <w:sz w:val="20"/>
+                <w:szCs w:val="28"/>
+              </w:rPr>
+              <w:t>13</w:t>
+            </w:r>
+          </w:p>
+        </w:tc>
+        <w:tc>
+          <w:tcPr>
+            <w:tcW w:w="2438" w:type="dxa"/>
+            <w:shd w:val="clear" w:color="auto" w:fill="C6D9F1" w:themeFill="text2" w:themeFillTint="33"/>
+            <w:vAlign w:val="center"/>
+          </w:tcPr>
+          <w:p>
+            <w:pPr>
+              <w:spacing w:after="40"/>
+            </w:pPr>
+            <w:r>
+              <w:rPr>
+                <w:sz w:val="16"/>
+              </w:rPr>
+              <w:t>HTTP 200</w:t>
+            </w:r>
+          </w:p>
+        </w:tc>
+        <w:tc>
+          <w:tcPr>
+            <w:tcW w:w="2665" w:type="dxa"/>
+            <w:shd w:val="clear" w:color="auto" w:fill="C6D9F1" w:themeFill="text2" w:themeFillTint="33"/>
+            <w:vAlign w:val="center"/>
+          </w:tcPr>
+          <w:p>
+            <w:pPr>
+              <w:spacing w:after="40"/>
+            </w:pPr>
+            <w:r>
+              <w:rPr>
+                <w:sz w:val="16"/>
+              </w:rPr>
+              <w:t>AuthController → Frontend</w:t>
+            </w:r>
+          </w:p>
+        </w:tc>
+        <w:tc>
+          <w:tcPr>
+            <w:tcW w:w="3628" w:type="dxa"/>
+            <w:shd w:val="clear" w:color="auto" w:fill="C6D9F1" w:themeFill="text2" w:themeFillTint="33"/>
+            <w:vAlign w:val="center"/>
+          </w:tcPr>
+          <w:p>
+            <w:pPr>
+              <w:spacing w:after="40"/>
+            </w:pPr>
+            <w:r>
+              <w:rPr>
+                <w:sz w:val="16"/>
+              </w:rPr>
+              <w:t>Devuelve una respuesta de autenticación exitosa.</w:t>
+            </w:r>
+          </w:p>
+        </w:tc>
+      </w:tr>
+      <w:tr>
+        <w:trPr>
+          <w:jc w:val="center"/>
+        </w:trPr>
+        <w:tc>
+          <w:tcPr>
+            <w:tcW w:w="454" w:type="dxa"/>
+            <w:shd w:val="clear" w:color="auto" w:fill="1F497D" w:themeFill="text2"/>
+            <w:vAlign w:val="center"/>
+          </w:tcPr>
+          <w:p>
+            <w:pPr>
+              <w:spacing w:after="40"/>
+              <w:rPr>
+                <w:color w:val="FFFFFF" w:themeColor="background1"/>
+                <w:sz w:val="20"/>
+                <w:szCs w:val="28"/>
+              </w:rPr>
+            </w:pPr>
+            <w:r>
+              <w:rPr>
+                <w:color w:val="FFFFFF" w:themeColor="background1"/>
+                <w:sz w:val="20"/>
+                <w:szCs w:val="28"/>
+              </w:rPr>
+              <w:t>14</w:t>
+            </w:r>
+          </w:p>
+        </w:tc>
+        <w:tc>
+          <w:tcPr>
+            <w:tcW w:w="2438" w:type="dxa"/>
+            <w:shd w:val="clear" w:color="auto" w:fill="C6D9F1" w:themeFill="text2" w:themeFillTint="33"/>
+            <w:vAlign w:val="center"/>
+          </w:tcPr>
+          <w:p>
+            <w:pPr>
+              <w:spacing w:after="40"/>
+            </w:pPr>
+            <w:r>
+              <w:rPr>
+                <w:sz w:val="16"/>
+              </w:rPr>
+              <w:t>Redirigir a inicio.html</w:t>
+            </w:r>
+          </w:p>
+        </w:tc>
+        <w:tc>
+          <w:tcPr>
+            <w:tcW w:w="2665" w:type="dxa"/>
+            <w:shd w:val="clear" w:color="auto" w:fill="C6D9F1" w:themeFill="text2" w:themeFillTint="33"/>
+            <w:vAlign w:val="center"/>
+          </w:tcPr>
+          <w:p>
+            <w:pPr>
+              <w:spacing w:after="40"/>
+            </w:pPr>
+            <w:r>
+              <w:rPr>
+                <w:sz w:val="16"/>
+              </w:rPr>
+              <w:t>Frontend → Usuario</w:t>
+            </w:r>
+          </w:p>
+        </w:tc>
+        <w:tc>
+          <w:tcPr>
+            <w:tcW w:w="3628" w:type="dxa"/>
+            <w:shd w:val="clear" w:color="auto" w:fill="C6D9F1" w:themeFill="text2" w:themeFillTint="33"/>
+            <w:vAlign w:val="center"/>
+          </w:tcPr>
+          <w:p>
+            <w:pPr>
+              <w:spacing w:after="40"/>
+            </w:pPr>
+            <w:r>
+              <w:rPr>
+                <w:sz w:val="16"/>
+              </w:rPr>
+              <w:t>Presenta la página principal del sistema.</w:t>
+            </w:r>
+          </w:p>
+        </w:tc>
+      </w:tr>
+      <w:tr>
+        <w:trPr>
+          <w:jc w:val="center"/>
+        </w:trPr>
+        <w:tc>
+          <w:tcPr>
+            <w:tcW w:w="454" w:type="dxa"/>
+            <w:shd w:val="clear" w:color="auto" w:fill="1F497D" w:themeFill="text2"/>
+            <w:vAlign w:val="center"/>
+          </w:tcPr>
+          <w:p>
+            <w:pPr>
+              <w:spacing w:after="40"/>
+              <w:rPr>
+                <w:color w:val="FFFFFF" w:themeColor="background1"/>
+                <w:sz w:val="20"/>
+                <w:szCs w:val="28"/>
+              </w:rPr>
+            </w:pPr>
+            <w:r>
+              <w:rPr>
+                <w:color w:val="FFFFFF" w:themeColor="background1"/>
+                <w:sz w:val="20"/>
+                <w:szCs w:val="28"/>
+              </w:rPr>
+              <w:t>15</w:t>
+            </w:r>
+          </w:p>
+        </w:tc>
+        <w:tc>
+          <w:tcPr>
+            <w:tcW w:w="2438" w:type="dxa"/>
+            <w:shd w:val="clear" w:color="auto" w:fill="C6D9F1" w:themeFill="text2" w:themeFillTint="33"/>
+            <w:vAlign w:val="center"/>
+          </w:tcPr>
+          <w:p>
+            <w:pPr>
+              <w:spacing w:after="40"/>
+            </w:pPr>
+            <w:r>
+              <w:rPr>
+                <w:sz w:val="16"/>
+              </w:rPr>
+              <w:t>Error de autenticación</w:t>
+            </w:r>
+          </w:p>
+        </w:tc>
+        <w:tc>
+          <w:tcPr>
+            <w:tcW w:w="2665" w:type="dxa"/>
+            <w:shd w:val="clear" w:color="auto" w:fill="C6D9F1" w:themeFill="text2" w:themeFillTint="33"/>
+            <w:vAlign w:val="center"/>
+          </w:tcPr>
+          <w:p>
+            <w:pPr>
+              <w:spacing w:after="40"/>
+            </w:pPr>
+            <w:r>
+              <w:rPr>
+                <w:sz w:val="16"/>
+              </w:rPr>
+              <w:t>AuthService → AuthController</w:t>
+            </w:r>
+          </w:p>
+        </w:tc>
+        <w:tc>
+          <w:tcPr>
+            <w:tcW w:w="3628" w:type="dxa"/>
+            <w:shd w:val="clear" w:color="auto" w:fill="C6D9F1" w:themeFill="text2" w:themeFillTint="33"/>
+            <w:vAlign w:val="center"/>
+          </w:tcPr>
+          <w:p>
+            <w:pPr>
+              <w:spacing w:after="40"/>
+            </w:pPr>
+            <w:r>
+              <w:rPr>
+                <w:sz w:val="16"/>
+              </w:rPr>
+              <w:t>Informa que las credenciales son incorrectas o la cuenta está inactiva.</w:t>
+            </w:r>
+          </w:p>
+        </w:tc>
+      </w:tr>
+      <w:tr>
+        <w:trPr>
+          <w:jc w:val="center"/>
+        </w:trPr>
+        <w:tc>
+          <w:tcPr>
+            <w:tcW w:w="454" w:type="dxa"/>
+            <w:shd w:val="clear" w:color="auto" w:fill="1F497D" w:themeFill="text2"/>
+            <w:vAlign w:val="center"/>
+          </w:tcPr>
+          <w:p>
+            <w:pPr>
+              <w:spacing w:after="40"/>
+              <w:rPr>
+                <w:color w:val="FFFFFF" w:themeColor="background1"/>
+                <w:sz w:val="20"/>
+                <w:szCs w:val="28"/>
+              </w:rPr>
+            </w:pPr>
+            <w:r>
+              <w:rPr>
+                <w:color w:val="FFFFFF" w:themeColor="background1"/>
+                <w:sz w:val="20"/>
+                <w:szCs w:val="28"/>
+              </w:rPr>
+              <w:t>16</w:t>
+            </w:r>
+          </w:p>
+        </w:tc>
+        <w:tc>
+          <w:tcPr>
+            <w:tcW w:w="2438" w:type="dxa"/>
+            <w:shd w:val="clear" w:color="auto" w:fill="C6D9F1" w:themeFill="text2" w:themeFillTint="33"/>
+            <w:vAlign w:val="center"/>
+          </w:tcPr>
+          <w:p>
+            <w:pPr>
+              <w:spacing w:after="40"/>
+            </w:pPr>
+            <w:r>
+              <w:rPr>
+                <w:sz w:val="16"/>
+              </w:rPr>
+              <w:t>HTTP 401</w:t>
+            </w:r>
+          </w:p>
+        </w:tc>
+        <w:tc>
+          <w:tcPr>
+            <w:tcW w:w="2665" w:type="dxa"/>
+            <w:shd w:val="clear" w:color="auto" w:fill="C6D9F1" w:themeFill="text2" w:themeFillTint="33"/>
+            <w:vAlign w:val="center"/>
+          </w:tcPr>
+          <w:p>
+            <w:pPr>
+              <w:spacing w:after="40"/>
+            </w:pPr>
+            <w:r>
+              <w:rPr>
+                <w:sz w:val="16"/>
+              </w:rPr>
+              <w:t>AuthController → Frontend</w:t>
+            </w:r>
+          </w:p>
+        </w:tc>
+        <w:tc>
+          <w:tcPr>
+            <w:tcW w:w="3628" w:type="dxa"/>
+            <w:shd w:val="clear" w:color="auto" w:fill="C6D9F1" w:themeFill="text2" w:themeFillTint="33"/>
+            <w:vAlign w:val="center"/>
+          </w:tcPr>
+          <w:p>
+            <w:pPr>
+              <w:spacing w:after="40"/>
+            </w:pPr>
+            <w:r>
+              <w:rPr>
+                <w:sz w:val="16"/>
+              </w:rPr>
+              <w:t>Devuelve una respuesta indicando que la autenticación fue rechazada.</w:t>
+            </w:r>
+          </w:p>
+        </w:tc>
+      </w:tr>
+      <w:tr>
+        <w:trPr>
+          <w:jc w:val="center"/>
+        </w:trPr>
+        <w:tc>
+          <w:tcPr>
+            <w:tcW w:w="454" w:type="dxa"/>
+            <w:shd w:val="clear" w:color="auto" w:fill="1F497D" w:themeFill="text2"/>
+            <w:vAlign w:val="center"/>
+          </w:tcPr>
+          <w:p>
+            <w:pPr>
+              <w:spacing w:after="40"/>
+              <w:rPr>
+                <w:color w:val="FFFFFF" w:themeColor="background1"/>
+                <w:sz w:val="20"/>
+                <w:szCs w:val="28"/>
+              </w:rPr>
+            </w:pPr>
+            <w:r>
+              <w:rPr>
+                <w:color w:val="FFFFFF" w:themeColor="background1"/>
+                <w:sz w:val="20"/>
+                <w:szCs w:val="28"/>
+              </w:rPr>
+              <w:t>17</w:t>
+            </w:r>
+          </w:p>
+        </w:tc>
+        <w:tc>
+          <w:tcPr>
+            <w:tcW w:w="2438" w:type="dxa"/>
+            <w:shd w:val="clear" w:color="auto" w:fill="C6D9F1" w:themeFill="text2" w:themeFillTint="33"/>
+            <w:vAlign w:val="center"/>
+          </w:tcPr>
+          <w:p>
+            <w:pPr>
+              <w:spacing w:after="40"/>
+            </w:pPr>
+            <w:r>
+              <w:rPr>
+                <w:sz w:val="16"/>
+              </w:rPr>
+              <w:t>Mostrar mensaje de error</w:t>
+            </w:r>
+          </w:p>
+        </w:tc>
+        <w:tc>
+          <w:tcPr>
+            <w:tcW w:w="2665" w:type="dxa"/>
+            <w:shd w:val="clear" w:color="auto" w:fill="C6D9F1" w:themeFill="text2" w:themeFillTint="33"/>
+            <w:vAlign w:val="center"/>
+          </w:tcPr>
+          <w:p>
+            <w:pPr>
+              <w:spacing w:after="40"/>
+            </w:pPr>
+            <w:r>
+              <w:rPr>
+                <w:sz w:val="16"/>
+              </w:rPr>
+              <w:t>Frontend → Usuario</w:t>
+            </w:r>
+          </w:p>
+        </w:tc>
+        <w:tc>
+          <w:tcPr>
+            <w:tcW w:w="3628" w:type="dxa"/>
+            <w:shd w:val="clear" w:color="auto" w:fill="C6D9F1" w:themeFill="text2" w:themeFillTint="33"/>
+            <w:vAlign w:val="center"/>
+          </w:tcPr>
+          <w:p>
+            <w:pPr>
+              <w:spacing w:after="40"/>
+            </w:pPr>
+            <w:r>
+              <w:rPr>
+                <w:sz w:val="16"/>
+              </w:rPr>
+              <w:t>Informa al usuario que no fue posible iniciar sesión.</w:t>
+            </w:r>
+          </w:p>
+        </w:tc>
+      </w:tr>
+    </w:tbl>
+    <w:p>
+      <w:pPr>
+        <w:rPr>
+          <w:rFonts w:ascii="Arial" w:hAnsi="Arial" w:cs="Arial"/>
+          <w:color w:val="1F497D" w:themeColor="text2"/>
+          <w:lang w:eastAsia="es-ES"/>
+        </w:rPr>
+      </w:pPr>
+    </w:p>
+    <w:p>
+      <w:pPr>
         <w:pStyle w:val="Ttulo2"/>
         <w:rPr>
           <w:rFonts w:ascii="Arial" w:hAnsi="Arial" w:cs="Arial"/>
@@ -5999,6 +8360,7 @@
           <w:rFonts w:ascii="Arial" w:hAnsi="Arial" w:cs="Arial"/>
           <w:color w:val="1F497D" w:themeColor="text2"/>
         </w:rPr>
+        <w:lastRenderedPageBreak/>
         <w:t>Vista Despliegue</w:t>
       </w:r>
       <w:bookmarkEnd w:id="9"/>
@@ -6053,7 +8415,7 @@
                     </pic:cNvPicPr>
                   </pic:nvPicPr>
                   <pic:blipFill rotWithShape="1">
-                    <a:blip r:embed="rId15">
+                    <a:blip r:embed="rId16">
                       <a:extLst>
                         <a:ext uri="{28A0092B-C50C-407E-A947-70E740481C1C}">
                           <a14:useLocalDpi xmlns:a14="http://schemas.microsoft.com/office/drawing/2010/main" val="0"/>
@@ -6142,7 +8504,6 @@
           <w:sz w:val="24"/>
           <w:szCs w:val="24"/>
         </w:rPr>
-        <w:lastRenderedPageBreak/>
         <w:t>Diccionario diagrama de componentes.</w:t>
       </w:r>
     </w:p>
@@ -6281,7 +8642,14 @@
               <w:rPr>
                 <w:color w:val="1F497D" w:themeColor="text2"/>
               </w:rPr>
-              <w:t>Aplicación web HTML, CSS y JavaScript; interfaz y consumo de API por HTTP/JSON.</w:t>
+              <w:t xml:space="preserve">Aplicación web HTML, CSS y JavaScript; interfaz </w:t>
+            </w:r>
+            <w:r>
+              <w:rPr>
+                <w:color w:val="1F497D" w:themeColor="text2"/>
+              </w:rPr>
+              <w:lastRenderedPageBreak/>
+              <w:t>y consumo de API por HTTP/JSON.</w:t>
             </w:r>
           </w:p>
         </w:tc>
@@ -6310,6 +8678,7 @@
                 <w:sz w:val="24"/>
                 <w:szCs w:val="24"/>
               </w:rPr>
+              <w:lastRenderedPageBreak/>
               <w:t>Aplicación (Backend)</w:t>
             </w:r>
           </w:p>
@@ -6938,9 +9307,9 @@
       </w:pPr>
     </w:p>
     <w:sectPr>
-      <w:headerReference w:type="default" r:id="rId16"/>
-      <w:footerReference w:type="default" r:id="rId17"/>
-      <w:headerReference w:type="first" r:id="rId18"/>
+      <w:headerReference w:type="default" r:id="rId17"/>
+      <w:footerReference w:type="default" r:id="rId18"/>
+      <w:headerReference w:type="first" r:id="rId19"/>
       <w:pgSz w:w="12240" w:h="15840"/>
       <w:pgMar w:top="1417" w:right="1701" w:bottom="1417" w:left="1701" w:header="708" w:footer="708" w:gutter="0"/>
       <w:cols w:space="708"/>
@@ -10160,12 +12529,14 @@
     <w:rsid w:val="002835FC"/>
     <w:rsid w:val="00287AE5"/>
     <w:rsid w:val="002C06A7"/>
+    <w:rsid w:val="00357431"/>
     <w:rsid w:val="003B3FD5"/>
     <w:rsid w:val="004F7F49"/>
     <w:rsid w:val="005255E8"/>
     <w:rsid w:val="0057410B"/>
     <w:rsid w:val="00595623"/>
     <w:rsid w:val="005B27DB"/>
+    <w:rsid w:val="00631066"/>
     <w:rsid w:val="0063305D"/>
     <w:rsid w:val="006E2FCC"/>
     <w:rsid w:val="00704192"/>
@@ -10944,12 +13315,13 @@
 </file>
 
 <file path=customXml/item3.xml><?xml version="1.0" encoding="utf-8"?>
-<?mso-contentType ?>
-<FormTemplates xmlns="http://schemas.microsoft.com/sharepoint/v3/contenttype/forms">
-  <Display>DocumentLibraryForm</Display>
-  <Edit>DocumentLibraryForm</Edit>
-  <New>DocumentLibraryForm</New>
-</FormTemplates>
+<p:properties xmlns:p="http://schemas.microsoft.com/office/2006/metadata/properties" xmlns:xsi="http://www.w3.org/2001/XMLSchema-instance" xmlns:pc="http://schemas.microsoft.com/office/infopath/2007/PartnerControls">
+  <documentManagement>
+    <lcf76f155ced4ddcb4097134ff3c332f xmlns="e1e7bc46-bed0-459f-9452-a76b1c5b695e">
+      <Terms xmlns="http://schemas.microsoft.com/office/infopath/2007/PartnerControls"/>
+    </lcf76f155ced4ddcb4097134ff3c332f>
+  </documentManagement>
+</p:properties>
 </file>
 
 <file path=customXml/item4.xml><?xml version="1.0" encoding="utf-8"?>
@@ -11170,13 +13542,12 @@
 </file>
 
 <file path=customXml/item5.xml><?xml version="1.0" encoding="utf-8"?>
-<p:properties xmlns:p="http://schemas.microsoft.com/office/2006/metadata/properties" xmlns:xsi="http://www.w3.org/2001/XMLSchema-instance" xmlns:pc="http://schemas.microsoft.com/office/infopath/2007/PartnerControls">
-  <documentManagement>
-    <lcf76f155ced4ddcb4097134ff3c332f xmlns="e1e7bc46-bed0-459f-9452-a76b1c5b695e">
-      <Terms xmlns="http://schemas.microsoft.com/office/infopath/2007/PartnerControls"/>
-    </lcf76f155ced4ddcb4097134ff3c332f>
-  </documentManagement>
-</p:properties>
+<?mso-contentType ?>
+<FormTemplates xmlns="http://schemas.microsoft.com/sharepoint/v3/contenttype/forms">
+  <Display>DocumentLibraryForm</Display>
+  <Edit>DocumentLibraryForm</Edit>
+  <New>DocumentLibraryForm</New>
+</FormTemplates>
 </file>
 
 <file path=customXml/itemProps1.xml><?xml version="1.0" encoding="utf-8"?>
@@ -11196,9 +13567,11 @@
 </file>
 
 <file path=customXml/itemProps3.xml><?xml version="1.0" encoding="utf-8"?>
-<ds:datastoreItem xmlns:ds="http://schemas.openxmlformats.org/officeDocument/2006/customXml" ds:itemID="{EE9AAF0E-D63F-459F-A0FB-CDCE9F728F33}">
+<ds:datastoreItem xmlns:ds="http://schemas.openxmlformats.org/officeDocument/2006/customXml" ds:itemID="{E1036DFC-1D85-404D-898C-621D06C0EB1C}">
   <ds:schemaRefs>
-    <ds:schemaRef ds:uri="http://schemas.microsoft.com/sharepoint/v3/contenttype/forms"/>
+    <ds:schemaRef ds:uri="http://schemas.microsoft.com/office/2006/metadata/properties"/>
+    <ds:schemaRef ds:uri="http://schemas.microsoft.com/office/infopath/2007/PartnerControls"/>
+    <ds:schemaRef ds:uri="e1e7bc46-bed0-459f-9452-a76b1c5b695e"/>
   </ds:schemaRefs>
 </ds:datastoreItem>
 </file>
@@ -11223,11 +13596,9 @@
 </file>
 
 <file path=customXml/itemProps5.xml><?xml version="1.0" encoding="utf-8"?>
-<ds:datastoreItem xmlns:ds="http://schemas.openxmlformats.org/officeDocument/2006/customXml" ds:itemID="{E1036DFC-1D85-404D-898C-621D06C0EB1C}">
+<ds:datastoreItem xmlns:ds="http://schemas.openxmlformats.org/officeDocument/2006/customXml" ds:itemID="{EE9AAF0E-D63F-459F-A0FB-CDCE9F728F33}">
   <ds:schemaRefs>
-    <ds:schemaRef ds:uri="http://schemas.microsoft.com/office/2006/metadata/properties"/>
-    <ds:schemaRef ds:uri="http://schemas.microsoft.com/office/infopath/2007/PartnerControls"/>
-    <ds:schemaRef ds:uri="e1e7bc46-bed0-459f-9452-a76b1c5b695e"/>
+    <ds:schemaRef ds:uri="http://schemas.microsoft.com/sharepoint/v3/contenttype/forms"/>
   </ds:schemaRefs>
 </ds:datastoreItem>
 </file>
</xml_diff>